<commit_message>
94 Margaret Ave: price to drywall only, redesigned Excel summary
Moves mechanical/electrical finish and prime coat out of the fixed price,
rebuilds the client scope and CSVs, and replaces the Excel with a cleaner
summary (divisions, 40% margin, above-grade SF), detail, turnkey option and
schedule tabs.

Co-Authored-By: Claude Opus 5.5 <noreply@anthropic.com>
Claude-Session: https://claude.ai/code/session_01CBGsWEqizGP1qGXhU4Pc8p
</commit_message>
<xml_diff>
--- a/estimates/94_Margaret_Ave/94_Margaret_Ave_Client_Scope.docx
+++ b/estimates/94_Margaret_Ave/94_Margaret_Ave_Client_Scope.docx
@@ -66,7 +66,7 @@
         <w:rPr>
           <w:b w:val="0"/>
         </w:rPr>
-        <w:t>PalmView will demolish the existing dwelling and build a new two-storey home with basement and attached two-car garage, complete to drywall and prime coat under a fixed price. Specifications are entry level throughout: vinyl double-pane windows, insulated steel doors, asphalt shingles, brick/stone and stucco cladding as drawn. The basement is left unfinished. Finishes needed to complete the home are listed separately as an optional entry-level Finished Material Budget.</w:t>
+        <w:t>PalmView will demolish the existing dwelling and build a new two-storey home with basement and attached two-car garage, complete to drywall (Level 4, unprimed) under a fixed price. Specifications are entry level throughout: vinyl double-pane windows, insulated steel doors, asphalt shingles, brick/stone and stucco cladding as drawn. The basement is left unfinished. Finishes needed to complete the home are listed separately as an optional entry-level Finished Material Budget.</w:t>
       </w:r>
     </w:p>
     <w:p>
@@ -130,7 +130,7 @@
           <w:color w:val="1F3A2E"/>
           <w:sz w:val="28"/>
         </w:rPr>
-        <w:t>BLOCK 2 — FIXED COST (THROUGH DRYWALL AND PRIME COAT)</w:t>
+        <w:t>BLOCK 2 — FIXED COST (THROUGH DRYWALL)</w:t>
       </w:r>
     </w:p>
     <w:p>
@@ -448,7 +448,7 @@
         <w:pStyle w:val="ListBullet"/>
       </w:pPr>
       <w:r>
-        <w:t>Rough-in and finish plumbing for the powder room, main bath, ensuite, kitchen, laundry and two hose bibs. Basement 3-piece is rough-in only.</w:t>
+        <w:t>Rough-in plumbing for the powder room, main bath, ensuite, kitchen, laundry and two hose bibs. Basement 3-piece rough-in drains only.</w:t>
       </w:r>
     </w:p>
     <w:p>
@@ -456,7 +456,7 @@
         <w:pStyle w:val="ListBullet"/>
       </w:pPr>
       <w:r>
-        <w:t>Rough-in and finish gas for furnace, water heater and range.</w:t>
+        <w:t>Rough-in gas piping and venting for furnace, water heater and range.</w:t>
       </w:r>
     </w:p>
     <w:p>
@@ -464,7 +464,7 @@
         <w:pStyle w:val="ListBullet"/>
       </w:pPr>
       <w:r>
-        <w:t>Supply and install a high-efficiency gas furnace, central A/C, HRV, ductwork and thermostat.</w:t>
+        <w:t>Supply and install ductwork and HVAC rough-in; supply high-efficiency gas furnace, central A/C and HRV per HVAC design.</w:t>
       </w:r>
     </w:p>
     <w:p>
@@ -472,7 +472,7 @@
         <w:pStyle w:val="ListBullet"/>
       </w:pPr>
       <w:r>
-        <w:t>Install a new 200 A electrical service; rough-in and finish electrical to Ontario Electrical Safety Code, including smoke/CO alarms and basic basement lighting.</w:t>
+        <w:t>Install a new 200 A electrical service and rough-in all wiring and boxes to Ontario Electrical Safety Code, including basic basement lighting circuits.</w:t>
       </w:r>
     </w:p>
     <w:p>
@@ -488,7 +488,7 @@
         <w:pStyle w:val="ListBullet"/>
       </w:pPr>
       <w:r>
-        <w:t>Fixtures are not in this block; they are listed in the Finished Material Budget.</w:t>
+        <w:t>Mechanical and electrical finish (devices, fixture set, equipment startup) is not in this block; it is listed under Completion to Occupancy.</w:t>
       </w:r>
     </w:p>
     <w:p>
@@ -538,7 +538,7 @@
         <w:pStyle w:val="ListBullet"/>
       </w:pPr>
       <w:r>
-        <w:t>Apply one prime coat to main and second floor drywall.</w:t>
+        <w:t>Prime and paint are not included.</w:t>
       </w:r>
     </w:p>
     <w:p>
@@ -590,7 +590,7 @@
         <w:pStyle w:val="ListBullet"/>
       </w:pPr>
       <w:r>
-        <w:t>All finishes and fixtures listed in Block 3.</w:t>
+        <w:t>All finishes and fixtures listed in Block 3, prime coat and paint, and mechanical/electrical finish and startup.</w:t>
       </w:r>
     </w:p>
     <w:p>
@@ -634,7 +634,7 @@
           <w:b/>
           <w:sz w:val="23"/>
         </w:rPr>
-        <w:t>Block 2 — Fixed Cost: $1,728,439</w:t>
+        <w:t>Block 2 — Fixed Cost: $1,687,498</w:t>
       </w:r>
     </w:p>
     <w:p>
@@ -754,6 +754,22 @@
         <w:pStyle w:val="ListBullet"/>
       </w:pPr>
       <w:r>
+        <w:t>Complete plumbing, gas, HVAC and electrical finish: fixture set, devices, equipment startup.</w:t>
+      </w:r>
+    </w:p>
+    <w:p>
+      <w:pPr>
+        <w:pStyle w:val="ListBullet"/>
+      </w:pPr>
+      <w:r>
+        <w:t>Apply prime coat to main and second floor drywall.</w:t>
+      </w:r>
+    </w:p>
+    <w:p>
+      <w:pPr>
+        <w:pStyle w:val="ListBullet"/>
+      </w:pPr>
+      <w:r>
         <w:t>Provide site supervision for the finishing phase (approx. 3 additional months) and waste bins.</w:t>
       </w:r>
     </w:p>
@@ -782,7 +798,7 @@
           <w:b/>
           <w:sz w:val="23"/>
         </w:rPr>
-        <w:t>Completion to Occupancy: $141,083</w:t>
+        <w:t>Completion to Occupancy: $180,075</w:t>
       </w:r>
     </w:p>
     <w:p>
@@ -834,7 +850,7 @@
           </w:tcPr>
           <w:p>
             <w:r>
-              <w:t>Block 2 — Fixed Cost to Drywall &amp; Prime</w:t>
+              <w:t>Block 2 — Fixed Cost to Drywall</w:t>
             </w:r>
           </w:p>
         </w:tc>
@@ -844,7 +860,7 @@
           </w:tcPr>
           <w:p>
             <w:r>
-              <w:t>$1,728,439</w:t>
+              <w:t>$1,687,498</w:t>
             </w:r>
           </w:p>
         </w:tc>
@@ -872,7 +888,7 @@
               <w:rPr>
                 <w:b/>
               </w:rPr>
-              <w:t>$1,800,439</w:t>
+              <w:t>$1,759,498</w:t>
             </w:r>
           </w:p>
         </w:tc>
@@ -894,7 +910,7 @@
           </w:tcPr>
           <w:p>
             <w:r>
-              <w:t>$234,057</w:t>
+              <w:t>$228,735</w:t>
             </w:r>
           </w:p>
         </w:tc>
@@ -922,7 +938,7 @@
               <w:rPr>
                 <w:b/>
               </w:rPr>
-              <w:t>$2,034,496</w:t>
+              <w:t>$1,988,233</w:t>
             </w:r>
           </w:p>
         </w:tc>
@@ -984,7 +1000,7 @@
           </w:tcPr>
           <w:p>
             <w:r>
-              <w:t>$141,083</w:t>
+              <w:t>$180,075</w:t>
             </w:r>
           </w:p>
         </w:tc>
@@ -1012,7 +1028,7 @@
               <w:rPr>
                 <w:b/>
               </w:rPr>
-              <w:t>$2,219,555</w:t>
+              <w:t>$2,217,605</w:t>
             </w:r>
           </w:p>
         </w:tc>
@@ -1034,7 +1050,7 @@
           </w:tcPr>
           <w:p>
             <w:r>
-              <w:t>$288,542</w:t>
+              <w:t>$288,289</w:t>
             </w:r>
           </w:p>
         </w:tc>
@@ -1062,7 +1078,7 @@
               <w:rPr>
                 <w:b/>
               </w:rPr>
-              <w:t>$2,508,097</w:t>
+              <w:t>$2,505,894</w:t>
             </w:r>
           </w:p>
         </w:tc>

</xml_diff>